<commit_message>
Update uploaded academic .docx files
Refresh five uploaded Word documents in HRCP-KKU-Academic: academic/8/doc_2.docx, academic/8/doc_5.docx, academic/8/doc_7.docx, academic/position/1/p2doc_1.docx, and academic/position/1/p2doc_9.docx. These are binary content updates (likely content or formatting changes) to the stored academic/position documents; no source code was modified.
</commit_message>
<xml_diff>
--- a/HRCP-KKU-Academic/uploads/academic/8/doc_2.docx
+++ b/HRCP-KKU-Academic/uploads/academic/8/doc_2.docx
@@ -241,9 +241,18 @@
                 <w:szCs w:val="28"/>
                 <w:lang w:val="en-US" w:eastAsia="en-GB"/>
               </w:rPr>
-              <w:t>รองศาสตราจารย์สม ดี</w:t>
+              <w:t/>
             </w:r>
             <w:proofErr w:type="spellStart"/>
+            <w:r>
+              <w:rPr>
+                <w:rFonts w:ascii="TH Sarabun New" w:eastAsia="Times New Roman" w:hAnsi="TH Sarabun New" w:cs="TH Sarabun New"/>
+                <w:sz w:val="28"/>
+                <w:szCs w:val="28"/>
+                <w:lang w:val="en-US" w:eastAsia="en-GB"/>
+              </w:rPr>
+              <w:t/>
+            </w:r>
             <w:r>
               <w:rPr>
                 <w:rFonts w:ascii="TH Sarabun New" w:eastAsia="Times New Roman" w:hAnsi="TH Sarabun New" w:cs="TH Sarabun New"/>
@@ -293,9 +302,27 @@
                 <w:szCs w:val="28"/>
                 <w:lang w:val="en-US" w:eastAsia="en-GB"/>
               </w:rPr>
-              <w:t>คณบดีวิทยาลัยการคอมพิวเตอร์</w:t>
+              <w:t>รองคณบดีวิทยาลัยการคอมพิวเตอร์</w:t>
             </w:r>
             <w:proofErr w:type="spellStart"/>
+            <w:r>
+              <w:rPr>
+                <w:rFonts w:ascii="TH Sarabun New" w:eastAsia="Times New Roman" w:hAnsi="TH Sarabun New" w:cs="TH Sarabun New"/>
+                <w:sz w:val="28"/>
+                <w:szCs w:val="28"/>
+                <w:lang w:eastAsia="en-GB"/>
+              </w:rPr>
+              <w:t/>
+            </w:r>
+            <w:r>
+              <w:rPr>
+                <w:rFonts w:ascii="TH Sarabun New" w:eastAsia="Times New Roman" w:hAnsi="TH Sarabun New" w:cs="TH Sarabun New"/>
+                <w:sz w:val="28"/>
+                <w:szCs w:val="28"/>
+                <w:lang w:eastAsia="en-GB"/>
+              </w:rPr>
+              <w:t/>
+            </w:r>
             <w:r>
               <w:rPr>
                 <w:rFonts w:ascii="TH Sarabun New" w:eastAsia="Times New Roman" w:hAnsi="TH Sarabun New" w:cs="TH Sarabun New"/>
@@ -491,7 +518,7 @@
                 <w:szCs w:val="28"/>
                 <w:lang w:val="en-US" w:eastAsia="en-GB"/>
               </w:rPr>
-              <w:t>เจ้าหน้าที่บริหารงานทั่วไป</w:t>
+              <w:t>นักทรัพยากรบุคคล</w:t>
             </w:r>
             <w:proofErr w:type="spellStart"/>
             <w:r>
@@ -1562,6 +1589,7 @@
                 <w:lang w:val="en-US" w:eastAsia="en-GB"/>
               </w:rPr>
             </w:pPr>
+            <w:proofErr w:type="gramStart"/>
             <w:r>
               <w:rPr>
                 <w:rFonts w:ascii="TH Sarabun New" w:eastAsia="Times New Roman" w:hAnsi="TH Sarabun New" w:cs="TH Sarabun New"/>
@@ -1578,6 +1606,25 @@
                 <w:szCs w:val="28"/>
                 <w:lang w:val="en-US" w:eastAsia="en-GB"/>
               </w:rPr>
+              <w:t xml:space="preserve"> </w:t>
+            </w:r>
+            <w:r>
+              <w:rPr>
+                <w:rFonts w:ascii="TH Sarabun New" w:eastAsia="Times New Roman" w:hAnsi="TH Sarabun New" w:cs="TH Sarabun New"/>
+                <w:sz w:val="28"/>
+                <w:szCs w:val="28"/>
+                <w:lang w:val="en-US" w:eastAsia="en-GB"/>
+              </w:rPr>
+              <w:t/>
+            </w:r>
+            <w:proofErr w:type="gramEnd"/>
+            <w:r>
+              <w:rPr>
+                <w:rFonts w:ascii="TH Sarabun New" w:eastAsia="Times New Roman" w:hAnsi="TH Sarabun New" w:cs="TH Sarabun New"/>
+                <w:sz w:val="28"/>
+                <w:szCs w:val="28"/>
+                <w:lang w:val="en-US" w:eastAsia="en-GB"/>
+              </w:rPr>
               <w:t/>
             </w:r>
             <w:r>
@@ -1589,30 +1636,30 @@
               </w:rPr>
               <w:t/>
             </w:r>
+            <w:r>
+              <w:rPr>
+                <w:rFonts w:ascii="TH Sarabun New" w:eastAsia="Times New Roman" w:hAnsi="TH Sarabun New" w:cs="TH Sarabun New"/>
+                <w:sz w:val="28"/>
+                <w:szCs w:val="28"/>
+                <w:lang w:eastAsia="en-GB"/>
+              </w:rPr>
+              <w:t/>
+            </w:r>
+            <w:r>
+              <w:rPr>
+                <w:rFonts w:ascii="TH Sarabun New" w:eastAsia="Times New Roman" w:hAnsi="TH Sarabun New" w:cs="TH Sarabun New"/>
+                <w:sz w:val="28"/>
+                <w:szCs w:val="28"/>
+                <w:lang w:val="en-US" w:eastAsia="en-GB"/>
+              </w:rPr>
+              <w:t/>
+            </w:r>
             <w:proofErr w:type="gramStart"/>
             <w:r>
               <w:rPr>
                 <w:rFonts w:ascii="TH Sarabun New" w:eastAsia="Times New Roman" w:hAnsi="TH Sarabun New" w:cs="TH Sarabun New"/>
                 <w:sz w:val="28"/>
                 <w:szCs w:val="28"/>
-                <w:lang w:eastAsia="en-GB"/>
-              </w:rPr>
-              <w:t/>
-            </w:r>
-            <w:r>
-              <w:rPr>
-                <w:rFonts w:ascii="TH Sarabun New" w:eastAsia="Times New Roman" w:hAnsi="TH Sarabun New" w:cs="TH Sarabun New"/>
-                <w:sz w:val="28"/>
-                <w:szCs w:val="28"/>
-                <w:lang w:eastAsia="en-GB"/>
-              </w:rPr>
-              <w:t/>
-            </w:r>
-            <w:r>
-              <w:rPr>
-                <w:rFonts w:ascii="TH Sarabun New" w:eastAsia="Times New Roman" w:hAnsi="TH Sarabun New" w:cs="TH Sarabun New"/>
-                <w:sz w:val="28"/>
-                <w:szCs w:val="28"/>
                 <w:lang w:val="en-US" w:eastAsia="en-GB"/>
               </w:rPr>
               <w:t/>
@@ -1622,8 +1669,16 @@
                 <w:rFonts w:ascii="TH Sarabun New" w:hAnsi="TH Sarabun New" w:cs="TH Sarabun New"/>
                 <w:lang w:val="en-US" w:eastAsia="en-GB"/>
               </w:rPr>
+              <w:t xml:space="preserve"> </w:t>
+            </w:r>
+            <w:r>
+              <w:rPr>
+                <w:rFonts w:ascii="TH Sarabun New" w:hAnsi="TH Sarabun New" w:cs="TH Sarabun New"/>
+                <w:lang w:val="en-US" w:eastAsia="en-GB"/>
+              </w:rPr>
               <w:t>)</w:t>
             </w:r>
+            <w:proofErr w:type="gramEnd"/>
             <w:r>
               <w:rPr>
                 <w:rFonts w:ascii="TH Sarabun New" w:eastAsia="Times New Roman" w:hAnsi="TH Sarabun New" w:cs="TH Sarabun New"/>
@@ -1644,7 +1699,6 @@
               <w:t/>
             </w:r>
             <w:proofErr w:type="spellStart"/>
-            <w:proofErr w:type="gramEnd"/>
             <w:r>
               <w:rPr>
                 <w:rFonts w:ascii="TH Sarabun New" w:eastAsia="Times New Roman" w:hAnsi="TH Sarabun New" w:cs="TH Sarabun New"/>
@@ -1733,7 +1787,7 @@
                 <w:szCs w:val="28"/>
                 <w:lang w:val="en-US" w:eastAsia="en-GB"/>
               </w:rPr>
-              <w:t>รองศาสตราจารย์สม ดี</w:t>
+              <w:t/>
             </w:r>
             <w:proofErr w:type="spellStart"/>
             <w:r>
@@ -1784,7 +1838,7 @@
                 <w:szCs w:val="28"/>
                 <w:lang w:val="en-US" w:eastAsia="en-GB"/>
               </w:rPr>
-              <w:t>คณบดีวิทยาลัยการคอมพิวเตอร์</w:t>
+              <w:t/>
             </w:r>
             <w:proofErr w:type="spellStart"/>
             <w:r>
@@ -2536,6 +2590,7 @@
   <w:style w:type="character" w:default="1" w:styleId="a0">
     <w:name w:val="Default Paragraph Font"/>
     <w:uiPriority w:val="1"/>
+    <w:semiHidden/>
     <w:unhideWhenUsed/>
   </w:style>
   <w:style w:type="table" w:default="1" w:styleId="a1">

</xml_diff>